<commit_message>
Fix credential layout and resume download feedback; describe Assurant remit
</commit_message>
<xml_diff>
--- a/CLAUS HOERANDNER 1 page.docx
+++ b/CLAUS HOERANDNER 1 page.docx
@@ -147,6 +147,20 @@
           <w:sz w:val="20"/>
         </w:rPr>
         <w:t>Director of Accounting  |  Chicago, IL · Remote</w:t>
+      </w:r>
+    </w:p>
+    <w:p>
+      <w:pPr>
+        <w:keepNext w:val="0"/>
+        <w:spacing w:after="40" w:before="0"/>
+        <w:ind w:left="173" w:hanging="173"/>
+      </w:pPr>
+      <w:r>
+        <w:rPr>
+          <w:b w:val="0"/>
+          <w:sz w:val="20"/>
+        </w:rPr>
+        <w:t>• Helping modernize reporting capabilities and accelerate practical AI adoption across the organization.</w:t>
       </w:r>
     </w:p>
     <w:p>

</xml_diff>